<commit_message>
Update Methodology_and_Architecture.docx with latest version edited at 12:19 AM from Downloads
</commit_message>
<xml_diff>
--- a/docs/Methodology_and_Architecture.docx
+++ b/docs/Methodology_and_Architecture.docx
@@ -51,13 +51,7 @@
     </w:p>
     <w:p>
       <w:r>
-        <w:t>Medical insurance policy verification represents a major operational challenge in community pharmacy workflows. In the Egyptian healthcare ecosystem, pharmacists interact with over 70 insurance organizations and Third Party Administrators (TPAs)—each enforcing distinct dispensing rules, exclusion lists (</w:t>
-      </w:r>
-      <w:r>
-        <w:t>المحظورات</w:t>
-      </w:r>
-      <w:r>
-        <w:t>), validity periods, stamp requirements, and prior authorization protocols.</w:t>
+        <w:t>Medical insurance policy verification represents a major operational challenge in community pharmacy workflows. In the Egyptian healthcare ecosystem, pharmacists interact with over 70 insurance organizations and Third Party Administrators (TPAs)—each enforcing distinct dispensing rules, exclusion lists (المحظورات), validity periods, stamp requirements, and prior authorization protocols.</w:t>
       </w:r>
     </w:p>
     <w:p>
@@ -203,121 +197,7 @@
         <w:t xml:space="preserve">Categorized Rules (P): </w:t>
       </w:r>
       <w:r>
-        <w:t>Structured categories covering dispensing forms (</w:t>
-      </w:r>
-      <w:r>
-        <w:t>نماذج</w:t>
-      </w:r>
-      <w:r>
-        <w:t xml:space="preserve"> </w:t>
-      </w:r>
-      <w:r>
-        <w:t>الصرف</w:t>
-      </w:r>
-      <w:r>
-        <w:t>), exclusion lists (</w:t>
-      </w:r>
-      <w:r>
-        <w:t>المحظورات</w:t>
-      </w:r>
-      <w:r>
-        <w:t>), max duration (</w:t>
-      </w:r>
-      <w:r>
-        <w:t>أقصى</w:t>
-      </w:r>
-      <w:r>
-        <w:t xml:space="preserve"> </w:t>
-      </w:r>
-      <w:r>
-        <w:t>مدة</w:t>
-      </w:r>
-      <w:r>
-        <w:t xml:space="preserve"> </w:t>
-      </w:r>
-      <w:r>
-        <w:t>للصرف</w:t>
-      </w:r>
-      <w:r>
-        <w:t>), stamp requirements (</w:t>
-      </w:r>
-      <w:r>
-        <w:t>الختم</w:t>
-      </w:r>
-      <w:r>
-        <w:t>/</w:t>
-      </w:r>
-      <w:r>
-        <w:t>إمضاء</w:t>
-      </w:r>
-      <w:r>
-        <w:t xml:space="preserve"> </w:t>
-      </w:r>
-      <w:r>
-        <w:t>العميل</w:t>
-      </w:r>
-      <w:r>
-        <w:t>), form validity (</w:t>
-      </w:r>
-      <w:r>
-        <w:t>صلاحية</w:t>
-      </w:r>
-      <w:r>
-        <w:t xml:space="preserve"> </w:t>
-      </w:r>
-      <w:r>
-        <w:t>النموذج</w:t>
-      </w:r>
-      <w:r>
-        <w:t>), card/ID copy rules (</w:t>
-      </w:r>
-      <w:r>
-        <w:t>صورة</w:t>
-      </w:r>
-      <w:r>
-        <w:t xml:space="preserve"> </w:t>
-      </w:r>
-      <w:r>
-        <w:t>الكارنية</w:t>
-      </w:r>
-      <w:r>
-        <w:t>/</w:t>
-      </w:r>
-      <w:r>
-        <w:t>البطاقة</w:t>
-      </w:r>
-      <w:r>
-        <w:t>), co-payment limits (</w:t>
-      </w:r>
-      <w:r>
-        <w:t>التحمل</w:t>
-      </w:r>
-      <w:r>
-        <w:t>/</w:t>
-      </w:r>
-      <w:r>
-        <w:t>الحد</w:t>
-      </w:r>
-      <w:r>
-        <w:t xml:space="preserve"> </w:t>
-      </w:r>
-      <w:r>
-        <w:t>الأقصى</w:t>
-      </w:r>
-      <w:r>
-        <w:t>), and approval contact endpoints (</w:t>
-      </w:r>
-      <w:r>
-        <w:t>التواصل</w:t>
-      </w:r>
-      <w:r>
-        <w:t xml:space="preserve"> </w:t>
-      </w:r>
-      <w:r>
-        <w:t>للموافقات</w:t>
-      </w:r>
-      <w:r>
-        <w:t>).</w:t>
+        <w:t>Structured categories covering dispensing forms (نماذج الصرف), exclusion lists (المحظورات), max duration (أقصى مدة للصرف), stamp requirements (الختم/إمضاء العميل), form validity (صلاحية النموذج), card/ID copy rules (صورة الكارنية/البطاقة), co-payment limits (التحمل/الحد الأقصى), and approval contact endpoints (التواصل للموافقات).</w:t>
       </w:r>
     </w:p>
     <w:p>
@@ -336,31 +216,7 @@
     </w:p>
     <w:p>
       <w:r>
-        <w:t>To support natural language queries in both Arabic and English (e.g., '</w:t>
-      </w:r>
-      <w:r>
-        <w:t>ما</w:t>
-      </w:r>
-      <w:r>
-        <w:t xml:space="preserve"> </w:t>
-      </w:r>
-      <w:r>
-        <w:t>هي</w:t>
-      </w:r>
-      <w:r>
-        <w:t xml:space="preserve"> </w:t>
-      </w:r>
-      <w:r>
-        <w:t>محظورات</w:t>
-      </w:r>
-      <w:r>
-        <w:t xml:space="preserve"> </w:t>
-      </w:r>
-      <w:r>
-        <w:t>يونايتد؟</w:t>
-      </w:r>
-      <w:r>
-        <w:t>' or 'What are the stamp requirements for GlobeMed?'), the system employs a multi-tiered search engine.</w:t>
+        <w:t>To support natural language queries in both Arabic and English (e.g., 'ما هي محظورات يونايتد؟' or 'What are the stamp requirements for GlobeMed?'), the system employs a multi-tiered search engine.</w:t>
       </w:r>
     </w:p>
     <w:p>
@@ -400,31 +256,7 @@
         <w:t xml:space="preserve">2. Alef Normalization: </w:t>
       </w:r>
       <w:r>
-        <w:t xml:space="preserve">Standardizes </w:t>
-      </w:r>
-      <w:r>
-        <w:t>أ</w:t>
-      </w:r>
-      <w:r>
-        <w:t xml:space="preserve">, </w:t>
-      </w:r>
-      <w:r>
-        <w:t>إ</w:t>
-      </w:r>
-      <w:r>
-        <w:t xml:space="preserve">, </w:t>
-      </w:r>
-      <w:r>
-        <w:t>آ</w:t>
-      </w:r>
-      <w:r>
-        <w:t xml:space="preserve"> → </w:t>
-      </w:r>
-      <w:r>
-        <w:t>ا</w:t>
-      </w:r>
-      <w:r>
-        <w:t>.</w:t>
+        <w:t>Standardizes أ, إ, آ → ا.</w:t>
       </w:r>
     </w:p>
     <w:p>
@@ -438,31 +270,7 @@
         <w:t xml:space="preserve">3. Ta Marbuta &amp; Ya Normalization: </w:t>
       </w:r>
       <w:r>
-        <w:t xml:space="preserve">Converts </w:t>
-      </w:r>
-      <w:r>
-        <w:t>ة</w:t>
-      </w:r>
-      <w:r>
-        <w:t xml:space="preserve"> → </w:t>
-      </w:r>
-      <w:r>
-        <w:t>ه</w:t>
-      </w:r>
-      <w:r>
-        <w:t xml:space="preserve"> and </w:t>
-      </w:r>
-      <w:r>
-        <w:t>ى</w:t>
-      </w:r>
-      <w:r>
-        <w:t xml:space="preserve"> → </w:t>
-      </w:r>
-      <w:r>
-        <w:t>ي</w:t>
-      </w:r>
-      <w:r>
-        <w:t>.</w:t>
+        <w:t>Converts ة → ه and ى → ي.</w:t>
       </w:r>
     </w:p>
     <w:p>
@@ -476,31 +284,7 @@
         <w:t xml:space="preserve">4. Stop-Word Filtering: </w:t>
       </w:r>
       <w:r>
-        <w:t>Filters non-informative functional terms (</w:t>
-      </w:r>
-      <w:r>
-        <w:t>في</w:t>
-      </w:r>
-      <w:r>
-        <w:t xml:space="preserve">, </w:t>
-      </w:r>
-      <w:r>
-        <w:t>من</w:t>
-      </w:r>
-      <w:r>
-        <w:t xml:space="preserve">, </w:t>
-      </w:r>
-      <w:r>
-        <w:t>على</w:t>
-      </w:r>
-      <w:r>
-        <w:t xml:space="preserve">, </w:t>
-      </w:r>
-      <w:r>
-        <w:t>أن</w:t>
-      </w:r>
-      <w:r>
-        <w:t>, ...).</w:t>
+        <w:t>Filters non-informative functional terms (في, من, على, أن, ...).</w:t>
       </w:r>
     </w:p>
     <w:p>
@@ -1340,31 +1124,31 @@
       </w:rPr>
     </w:lvl>
   </w:abstractNum>
-  <w:num w:numId="1" w16cid:durableId="1985810691">
+  <w:num w:numId="1" w16cid:durableId="259946443">
     <w:abstractNumId w:val="8"/>
   </w:num>
-  <w:num w:numId="2" w16cid:durableId="1863395265">
+  <w:num w:numId="2" w16cid:durableId="1390493088">
     <w:abstractNumId w:val="6"/>
   </w:num>
-  <w:num w:numId="3" w16cid:durableId="65764104">
+  <w:num w:numId="3" w16cid:durableId="1836140196">
     <w:abstractNumId w:val="5"/>
   </w:num>
-  <w:num w:numId="4" w16cid:durableId="738748389">
+  <w:num w:numId="4" w16cid:durableId="1531457147">
     <w:abstractNumId w:val="4"/>
   </w:num>
-  <w:num w:numId="5" w16cid:durableId="1765564673">
+  <w:num w:numId="5" w16cid:durableId="2079086626">
     <w:abstractNumId w:val="7"/>
   </w:num>
-  <w:num w:numId="6" w16cid:durableId="1514763353">
+  <w:num w:numId="6" w16cid:durableId="1338313927">
     <w:abstractNumId w:val="3"/>
   </w:num>
-  <w:num w:numId="7" w16cid:durableId="1484154874">
+  <w:num w:numId="7" w16cid:durableId="697319081">
     <w:abstractNumId w:val="2"/>
   </w:num>
-  <w:num w:numId="8" w16cid:durableId="613097527">
+  <w:num w:numId="8" w16cid:durableId="2030837522">
     <w:abstractNumId w:val="1"/>
   </w:num>
-  <w:num w:numId="9" w16cid:durableId="352071103">
+  <w:num w:numId="9" w16cid:durableId="1782841913">
     <w:abstractNumId w:val="0"/>
   </w:num>
 </w:numbering>

</xml_diff>